<commit_message>
docs(guia): acotar guia de pruebas a las actualizaciones del 09 y 10 de julio
</commit_message>
<xml_diff>
--- a/GUIA_PRUEBAS_AZUR.docx
+++ b/GUIA_PRUEBAS_AZUR.docx
@@ -82,7 +82,7 @@
                 <w:color w:val="1A1516"/>
                 <w:sz w:val="21"/>
               </w:rPr>
-              <w:t>Guía de pruebas · Actualizaciones (Comercial · Roles · Firmas · Proyecto)</w:t>
+              <w:t>Guía de pruebas · Actualizaciones del 09 y 10 de julio</w:t>
             </w:r>
           </w:p>
         </w:tc>
@@ -357,7 +357,7 @@
           <w:color w:val="1A1516"/>
           <w:sz w:val="23"/>
         </w:rPr>
-        <w:t>Título de partida multilínea</w:t>
+        <w:t>Navegación con Tab (además de flechas y Enter)</w:t>
       </w:r>
       <w:r>
         <w:rPr>
@@ -378,7 +378,7 @@
           <w:color w:val="666666"/>
           <w:sz w:val="19"/>
         </w:rPr>
-        <w:t>Agrupar servicios en un mismo bloque con saltos de línea.</w:t>
+        <w:t>Moverse entre celdas como en Excel, ahora también con Tab.</w:t>
       </w:r>
     </w:p>
     <w:p>
@@ -390,7 +390,7 @@
         <w:rPr>
           <w:sz w:val="20"/>
         </w:rPr>
-        <w:t>Haz clic en el título de una partida.</w:t>
+        <w:t>Párate en una celda y usa Tab: avanza a la siguiente celda editable (izquierda→derecha) y salta de fila al final; Shift+Tab retrocede.</w:t>
       </w:r>
     </w:p>
     <w:p>
@@ -402,128 +402,7 @@
         <w:rPr>
           <w:sz w:val="20"/>
         </w:rPr>
-        <w:t>Presiona Enter para agregar una línea dentro del mismo bloque.</w:t>
-      </w:r>
-    </w:p>
-    <w:p>
-      <w:pPr>
-        <w:pStyle w:val="ListNumber"/>
-        <w:ind w:left="792"/>
-      </w:pPr>
-      <w:r>
-        <w:rPr>
-          <w:sz w:val="20"/>
-        </w:rPr>
-        <w:t>Genera el PDF.</w:t>
-      </w:r>
-    </w:p>
-    <w:p>
-      <w:pPr>
-        <w:spacing w:before="20"/>
-        <w:ind w:left="403"/>
-      </w:pPr>
-      <w:r>
-        <w:rPr>
-          <w:b/>
-          <w:color w:val="0A7D33"/>
-          <w:sz w:val="19"/>
-        </w:rPr>
-        <w:t xml:space="preserve">Esperado:  </w:t>
-      </w:r>
-      <w:r>
-        <w:rPr>
-          <w:color w:val="1A1516"/>
-          <w:sz w:val="19"/>
-        </w:rPr>
-        <w:t>El PDF respeta los saltos de línea del título.</w:t>
-      </w:r>
-    </w:p>
-    <w:p>
-      <w:pPr>
-        <w:spacing w:before="160" w:after="0"/>
-      </w:pPr>
-      <w:r>
-        <w:rPr>
-          <w:sz w:val="24"/>
-        </w:rPr>
-        <w:t xml:space="preserve">☐  </w:t>
-      </w:r>
-      <w:r>
-        <w:rPr>
-          <w:b/>
-          <w:color w:val="1A1516"/>
-          <w:sz w:val="23"/>
-        </w:rPr>
-        <w:t>Navegación tipo Excel (flechas, Enter y Tab)</w:t>
-      </w:r>
-      <w:r>
-        <w:rPr>
-          <w:color w:val="666666"/>
-          <w:sz w:val="15"/>
-        </w:rPr>
-        <w:t xml:space="preserve">    ITEMIZADO</w:t>
-      </w:r>
-    </w:p>
-    <w:p>
-      <w:pPr>
-        <w:spacing w:after="40"/>
-        <w:ind w:left="403"/>
-      </w:pPr>
-      <w:r>
-        <w:rPr>
-          <w:i/>
-          <w:color w:val="666666"/>
-          <w:sz w:val="19"/>
-        </w:rPr>
-        <w:t>Moverse entre celdas sin hacer clic afuera, como en Excel.</w:t>
-      </w:r>
-    </w:p>
-    <w:p>
-      <w:pPr>
-        <w:pStyle w:val="ListNumber"/>
-        <w:ind w:left="792"/>
-      </w:pPr>
-      <w:r>
-        <w:rPr>
-          <w:sz w:val="20"/>
-        </w:rPr>
-        <w:t>Párate en una celda (título, cantidad, costo…).</w:t>
-      </w:r>
-    </w:p>
-    <w:p>
-      <w:pPr>
-        <w:pStyle w:val="ListNumber"/>
-        <w:ind w:left="792"/>
-      </w:pPr>
-      <w:r>
-        <w:rPr>
-          <w:sz w:val="20"/>
-        </w:rPr>
-        <w:t>↑/↓: salta a la misma columna de la fila anterior/siguiente.</w:t>
-      </w:r>
-    </w:p>
-    <w:p>
-      <w:pPr>
-        <w:pStyle w:val="ListNumber"/>
-        <w:ind w:left="792"/>
-      </w:pPr>
-      <w:r>
-        <w:rPr>
-          <w:sz w:val="20"/>
-        </w:rPr>
-        <w:t>Tab: avanza a la siguiente celda editable (izquierda→derecha) y salta de fila al final; Shift+Tab retrocede.</w:t>
-      </w:r>
-    </w:p>
-    <w:p>
-      <w:pPr>
-        <w:pStyle w:val="ListNumber"/>
-        <w:ind w:left="792"/>
-      </w:pPr>
-      <w:r>
-        <w:rPr>
-          <w:sz w:val="20"/>
-        </w:rPr>
-        <w:t>Enter: baja una fila (dentro del título multilínea, agrega salto de línea).</w:t>
+        <w:t>↑/↓ saltan a la misma columna de la fila anterior/siguiente; Enter baja una fila.</w:t>
       </w:r>
     </w:p>
     <w:p>
@@ -545,370 +424,6 @@
           <w:sz w:val="19"/>
         </w:rPr>
         <w:t>Tab se salta los botones de acción y se mueve solo entre celdas editables; en el borde deja el Tab normal para salir de la tabla.</w:t>
-      </w:r>
-    </w:p>
-    <w:p>
-      <w:pPr>
-        <w:spacing w:before="160" w:after="0"/>
-      </w:pPr>
-      <w:r>
-        <w:rPr>
-          <w:sz w:val="24"/>
-        </w:rPr>
-        <w:t xml:space="preserve">☐  </w:t>
-      </w:r>
-      <w:r>
-        <w:rPr>
-          <w:b/>
-          <w:color w:val="1A1516"/>
-          <w:sz w:val="23"/>
-        </w:rPr>
-        <w:t>Importar itemizado desde Excel</w:t>
-      </w:r>
-      <w:r>
-        <w:rPr>
-          <w:color w:val="666666"/>
-          <w:sz w:val="15"/>
-        </w:rPr>
-        <w:t xml:space="preserve">    IMPORTAR</w:t>
-      </w:r>
-    </w:p>
-    <w:p>
-      <w:pPr>
-        <w:spacing w:after="40"/>
-        <w:ind w:left="403"/>
-      </w:pPr>
-      <w:r>
-        <w:rPr>
-          <w:i/>
-          <w:color w:val="666666"/>
-          <w:sz w:val="19"/>
-        </w:rPr>
-        <w:t>Plantilla brandeada AZUR + parser que ubica la cabecera.</w:t>
-      </w:r>
-    </w:p>
-    <w:p>
-      <w:pPr>
-        <w:pStyle w:val="ListNumber"/>
-        <w:ind w:left="792"/>
-      </w:pPr>
-      <w:r>
-        <w:rPr>
-          <w:sz w:val="20"/>
-        </w:rPr>
-        <w:t>Botón Importar Excel (junto a “Agregar partida”).</w:t>
-      </w:r>
-    </w:p>
-    <w:p>
-      <w:pPr>
-        <w:pStyle w:val="ListNumber"/>
-        <w:ind w:left="792"/>
-      </w:pPr>
-      <w:r>
-        <w:rPr>
-          <w:sz w:val="20"/>
-        </w:rPr>
-        <w:t>Clic en Plantilla: descarga un .xlsx brandeado (barra roja AZUR, cabecera, ejemplos).</w:t>
-      </w:r>
-    </w:p>
-    <w:p>
-      <w:pPr>
-        <w:pStyle w:val="ListNumber"/>
-        <w:ind w:left="792"/>
-      </w:pPr>
-      <w:r>
-        <w:rPr>
-          <w:sz w:val="20"/>
-        </w:rPr>
-        <w:t>Complétala y súbela, o copia/pega las filas.</w:t>
-      </w:r>
-    </w:p>
-    <w:p>
-      <w:pPr>
-        <w:pStyle w:val="ListNumber"/>
-        <w:ind w:left="792"/>
-      </w:pPr>
-      <w:r>
-        <w:rPr>
-          <w:sz w:val="20"/>
-        </w:rPr>
-        <w:t>Revisa la vista previa y pulsa Importar.</w:t>
-      </w:r>
-    </w:p>
-    <w:p>
-      <w:pPr>
-        <w:spacing w:before="20"/>
-        <w:ind w:left="403"/>
-      </w:pPr>
-      <w:r>
-        <w:rPr>
-          <w:b/>
-          <w:color w:val="0A7D33"/>
-          <w:sz w:val="19"/>
-        </w:rPr>
-        <w:t xml:space="preserve">Esperado:  </w:t>
-      </w:r>
-      <w:r>
-        <w:rPr>
-          <w:color w:val="1A1516"/>
-          <w:sz w:val="19"/>
-        </w:rPr>
-        <w:t>Se crean las partidas con jerarquía por Nivel (1=partida, 2=sub partida). Importa valores, no fórmulas.</w:t>
-      </w:r>
-    </w:p>
-    <w:p>
-      <w:pPr>
-        <w:spacing w:before="160" w:after="0"/>
-      </w:pPr>
-      <w:r>
-        <w:rPr>
-          <w:sz w:val="24"/>
-        </w:rPr>
-        <w:t xml:space="preserve">☐  </w:t>
-      </w:r>
-      <w:r>
-        <w:rPr>
-          <w:b/>
-          <w:color w:val="1A1516"/>
-          <w:sz w:val="23"/>
-        </w:rPr>
-        <w:t>GG / GA / Utilidad en 0% y ocultos</w:t>
-      </w:r>
-      <w:r>
-        <w:rPr>
-          <w:color w:val="666666"/>
-          <w:sz w:val="15"/>
-        </w:rPr>
-        <w:t xml:space="preserve">    TOTALES</w:t>
-      </w:r>
-    </w:p>
-    <w:p>
-      <w:pPr>
-        <w:spacing w:after="40"/>
-        <w:ind w:left="403"/>
-      </w:pPr>
-      <w:r>
-        <w:rPr>
-          <w:i/>
-          <w:color w:val="666666"/>
-          <w:sz w:val="19"/>
-        </w:rPr>
-        <w:t>La nueva cotización nace limpia; solo IGV visible.</w:t>
-      </w:r>
-    </w:p>
-    <w:p>
-      <w:pPr>
-        <w:pStyle w:val="ListNumber"/>
-        <w:ind w:left="792"/>
-      </w:pPr>
-      <w:r>
-        <w:rPr>
-          <w:sz w:val="20"/>
-        </w:rPr>
-        <w:t>Crea una nueva cotización.</w:t>
-      </w:r>
-    </w:p>
-    <w:p>
-      <w:pPr>
-        <w:pStyle w:val="ListNumber"/>
-        <w:ind w:left="792"/>
-      </w:pPr>
-      <w:r>
-        <w:rPr>
-          <w:sz w:val="20"/>
-        </w:rPr>
-        <w:t>Mira el bloque de totales.</w:t>
-      </w:r>
-    </w:p>
-    <w:p>
-      <w:pPr>
-        <w:spacing w:before="20"/>
-        <w:ind w:left="403"/>
-      </w:pPr>
-      <w:r>
-        <w:rPr>
-          <w:b/>
-          <w:color w:val="0A7D33"/>
-          <w:sz w:val="19"/>
-        </w:rPr>
-        <w:t xml:space="preserve">Esperado:  </w:t>
-      </w:r>
-      <w:r>
-        <w:rPr>
-          <w:color w:val="1A1516"/>
-          <w:sz w:val="19"/>
-        </w:rPr>
-        <w:t>GG, GA y utilidad nacen en 0% y no visibles; solo el IGV. Tú los activas y editas si los necesitas.</w:t>
-      </w:r>
-    </w:p>
-    <w:p>
-      <w:pPr>
-        <w:spacing w:before="160" w:after="0"/>
-      </w:pPr>
-      <w:r>
-        <w:rPr>
-          <w:sz w:val="24"/>
-        </w:rPr>
-        <w:t xml:space="preserve">☐  </w:t>
-      </w:r>
-      <w:r>
-        <w:rPr>
-          <w:b/>
-          <w:color w:val="1A1516"/>
-          <w:sz w:val="23"/>
-        </w:rPr>
-        <w:t>Viñetas automáticas</w:t>
-      </w:r>
-      <w:r>
-        <w:rPr>
-          <w:color w:val="666666"/>
-          <w:sz w:val="15"/>
-        </w:rPr>
-        <w:t xml:space="preserve">    CONDICIONES</w:t>
-      </w:r>
-    </w:p>
-    <w:p>
-      <w:pPr>
-        <w:spacing w:after="40"/>
-        <w:ind w:left="403"/>
-      </w:pPr>
-      <w:r>
-        <w:rPr>
-          <w:i/>
-          <w:color w:val="666666"/>
-          <w:sz w:val="19"/>
-        </w:rPr>
-        <w:t>Bullets ordenados sin poner asteriscos a mano.</w:t>
-      </w:r>
-    </w:p>
-    <w:p>
-      <w:pPr>
-        <w:pStyle w:val="ListNumber"/>
-        <w:ind w:left="792"/>
-      </w:pPr>
-      <w:r>
-        <w:rPr>
-          <w:sz w:val="20"/>
-        </w:rPr>
-        <w:t>Condiciones y pago → campos Condiciones / Servicios incluidos / omitidos.</w:t>
-      </w:r>
-    </w:p>
-    <w:p>
-      <w:pPr>
-        <w:pStyle w:val="ListNumber"/>
-        <w:ind w:left="792"/>
-      </w:pPr>
-      <w:r>
-        <w:rPr>
-          <w:sz w:val="20"/>
-        </w:rPr>
-        <w:t>Escribe: arranca con • ; cada Enter agrega otra viñeta.</w:t>
-      </w:r>
-    </w:p>
-    <w:p>
-      <w:pPr>
-        <w:pStyle w:val="ListNumber"/>
-        <w:ind w:left="792"/>
-      </w:pPr>
-      <w:r>
-        <w:rPr>
-          <w:sz w:val="20"/>
-        </w:rPr>
-        <w:t>Genera el PDF.</w:t>
-      </w:r>
-    </w:p>
-    <w:p>
-      <w:pPr>
-        <w:spacing w:before="20"/>
-        <w:ind w:left="403"/>
-      </w:pPr>
-      <w:r>
-        <w:rPr>
-          <w:b/>
-          <w:color w:val="0A7D33"/>
-          <w:sz w:val="19"/>
-        </w:rPr>
-        <w:t xml:space="preserve">Esperado:  </w:t>
-      </w:r>
-      <w:r>
-        <w:rPr>
-          <w:color w:val="1A1516"/>
-          <w:sz w:val="19"/>
-        </w:rPr>
-        <w:t>Las viñetas salen ordenadas en el PDF.</w:t>
-      </w:r>
-    </w:p>
-    <w:p>
-      <w:pPr>
-        <w:spacing w:before="160" w:after="0"/>
-      </w:pPr>
-      <w:r>
-        <w:rPr>
-          <w:sz w:val="24"/>
-        </w:rPr>
-        <w:t xml:space="preserve">☐  </w:t>
-      </w:r>
-      <w:r>
-        <w:rPr>
-          <w:b/>
-          <w:color w:val="1A1516"/>
-          <w:sz w:val="23"/>
-        </w:rPr>
-        <w:t>Pestaña “Plantillas” separada</w:t>
-      </w:r>
-      <w:r>
-        <w:rPr>
-          <w:color w:val="666666"/>
-          <w:sz w:val="15"/>
-        </w:rPr>
-        <w:t xml:space="preserve">    LISTA</w:t>
-      </w:r>
-    </w:p>
-    <w:p>
-      <w:pPr>
-        <w:spacing w:after="40"/>
-        <w:ind w:left="403"/>
-      </w:pPr>
-      <w:r>
-        <w:rPr>
-          <w:i/>
-          <w:color w:val="666666"/>
-          <w:sz w:val="19"/>
-        </w:rPr>
-        <w:t>La lista ya no mezcla plantillas ni borradores.</w:t>
-      </w:r>
-    </w:p>
-    <w:p>
-      <w:pPr>
-        <w:pStyle w:val="ListNumber"/>
-        <w:ind w:left="792"/>
-      </w:pPr>
-      <w:r>
-        <w:rPr>
-          <w:sz w:val="20"/>
-        </w:rPr>
-        <w:t>En Comercial, alterna las pestañas Cotizaciones y Plantillas.</w:t>
-      </w:r>
-    </w:p>
-    <w:p>
-      <w:pPr>
-        <w:spacing w:before="20"/>
-        <w:ind w:left="403"/>
-      </w:pPr>
-      <w:r>
-        <w:rPr>
-          <w:b/>
-          <w:color w:val="0A7D33"/>
-          <w:sz w:val="19"/>
-        </w:rPr>
-        <w:t xml:space="preserve">Esperado:  </w:t>
-      </w:r>
-      <w:r>
-        <w:rPr>
-          <w:color w:val="1A1516"/>
-          <w:sz w:val="19"/>
-        </w:rPr>
-        <w:t>Las plantillas viven en su pestaña; la lista de cotizaciones queda limpia.</w:t>
       </w:r>
     </w:p>
     <w:p>
@@ -1012,14 +527,14 @@
           <w:color w:val="1A1516"/>
           <w:sz w:val="23"/>
         </w:rPr>
-        <w:t>Condiciones generales en el PDF</w:t>
+        <w:t>Menú de 3 puntos (acciones rápidas)</w:t>
       </w:r>
       <w:r>
         <w:rPr>
           <w:color w:val="666666"/>
           <w:sz w:val="15"/>
         </w:rPr>
-        <w:t xml:space="preserve">    BUG</w:t>
+        <w:t xml:space="preserve">    ACCIONES</w:t>
       </w:r>
     </w:p>
     <w:p>
@@ -1033,7 +548,7 @@
           <w:color w:val="666666"/>
           <w:sz w:val="19"/>
         </w:rPr>
-        <w:t>Antes no salían en el PDF.</w:t>
+        <w:t>Antes no abría; ahora funciona y trae acciones sin entrar a la cotización.</w:t>
       </w:r>
     </w:p>
     <w:p>
@@ -1045,7 +560,7 @@
         <w:rPr>
           <w:sz w:val="20"/>
         </w:rPr>
-        <w:t>Llena “Condiciones generales”.</w:t>
+        <w:t>En la lista de Comercial, clic en los 3 puntos de una fila.</w:t>
       </w:r>
     </w:p>
     <w:p>
@@ -1057,7 +572,7 @@
         <w:rPr>
           <w:sz w:val="20"/>
         </w:rPr>
-        <w:t>Genera el PDF de cliente.</w:t>
+        <w:t>Prueba: Descargar PDF, Copiar link, Enviar a revisión, Solicitar/Eliminar.</w:t>
       </w:r>
     </w:p>
     <w:p>
@@ -1078,80 +593,7 @@
           <w:color w:val="1A1516"/>
           <w:sz w:val="19"/>
         </w:rPr>
-        <w:t>Aparece la sección CONDICIONES GENERALES en el PDF.</w:t>
-      </w:r>
-    </w:p>
-    <w:p>
-      <w:pPr>
-        <w:spacing w:before="160" w:after="0"/>
-      </w:pPr>
-      <w:r>
-        <w:rPr>
-          <w:sz w:val="24"/>
-        </w:rPr>
-        <w:t xml:space="preserve">☐  </w:t>
-      </w:r>
-      <w:r>
-        <w:rPr>
-          <w:b/>
-          <w:color w:val="1A1516"/>
-          <w:sz w:val="23"/>
-        </w:rPr>
-        <w:t>Menú de 3 puntos</w:t>
-      </w:r>
-      <w:r>
-        <w:rPr>
-          <w:color w:val="666666"/>
-          <w:sz w:val="15"/>
-        </w:rPr>
-        <w:t xml:space="preserve">    BUG</w:t>
-      </w:r>
-    </w:p>
-    <w:p>
-      <w:pPr>
-        <w:spacing w:after="40"/>
-        <w:ind w:left="403"/>
-      </w:pPr>
-      <w:r>
-        <w:rPr>
-          <w:i/>
-          <w:color w:val="666666"/>
-          <w:sz w:val="19"/>
-        </w:rPr>
-        <w:t>No abría (un stopPropagation cortaba el clic).</w:t>
-      </w:r>
-    </w:p>
-    <w:p>
-      <w:pPr>
-        <w:pStyle w:val="ListNumber"/>
-        <w:ind w:left="792"/>
-      </w:pPr>
-      <w:r>
-        <w:rPr>
-          <w:sz w:val="20"/>
-        </w:rPr>
-        <w:t>En la lista de Comercial, clic en los 3 puntos de una fila.</w:t>
-      </w:r>
-    </w:p>
-    <w:p>
-      <w:pPr>
-        <w:spacing w:before="20"/>
-        <w:ind w:left="403"/>
-      </w:pPr>
-      <w:r>
-        <w:rPr>
-          <w:b/>
-          <w:color w:val="0A7D33"/>
-          <w:sz w:val="19"/>
-        </w:rPr>
-        <w:t xml:space="preserve">Esperado:  </w:t>
-      </w:r>
-      <w:r>
-        <w:rPr>
-          <w:color w:val="1A1516"/>
-          <w:sz w:val="19"/>
-        </w:rPr>
-        <w:t>El menú abre: Descargar PDF · Copiar link · Enviar a revisión · Duplicar · Solicitar/Eliminar.</w:t>
+        <w:t>El menú abre correctamente con todas las acciones.</w:t>
       </w:r>
     </w:p>
     <w:p>
@@ -1350,6 +792,103 @@
     </w:p>
     <w:p>
       <w:pPr>
+        <w:spacing w:before="160" w:after="0"/>
+      </w:pPr>
+      <w:r>
+        <w:rPr>
+          <w:sz w:val="24"/>
+        </w:rPr>
+        <w:t xml:space="preserve">☐  </w:t>
+      </w:r>
+      <w:r>
+        <w:rPr>
+          <w:b/>
+          <w:color w:val="1A1516"/>
+          <w:sz w:val="23"/>
+        </w:rPr>
+        <w:t>Plantilla de importación brandeada</w:t>
+      </w:r>
+      <w:r>
+        <w:rPr>
+          <w:color w:val="666666"/>
+          <w:sz w:val="15"/>
+        </w:rPr>
+        <w:t xml:space="preserve">    IMPORTAR</w:t>
+      </w:r>
+    </w:p>
+    <w:p>
+      <w:pPr>
+        <w:spacing w:after="40"/>
+        <w:ind w:left="403"/>
+      </w:pPr>
+      <w:r>
+        <w:rPr>
+          <w:i/>
+          <w:color w:val="666666"/>
+          <w:sz w:val="19"/>
+        </w:rPr>
+        <w:t>El botón Plantilla ahora descarga un .xlsx brandeado AZUR.</w:t>
+      </w:r>
+    </w:p>
+    <w:p>
+      <w:pPr>
+        <w:pStyle w:val="ListNumber"/>
+        <w:ind w:left="792"/>
+      </w:pPr>
+      <w:r>
+        <w:rPr>
+          <w:sz w:val="20"/>
+        </w:rPr>
+        <w:t>En una cotización: botón Importar Excel → Plantilla.</w:t>
+      </w:r>
+    </w:p>
+    <w:p>
+      <w:pPr>
+        <w:pStyle w:val="ListNumber"/>
+        <w:ind w:left="792"/>
+      </w:pPr>
+      <w:r>
+        <w:rPr>
+          <w:sz w:val="20"/>
+        </w:rPr>
+        <w:t>Descarga el .xlsx (barra roja AZUR, cabecera, instrucciones, ejemplos).</w:t>
+      </w:r>
+    </w:p>
+    <w:p>
+      <w:pPr>
+        <w:pStyle w:val="ListNumber"/>
+        <w:ind w:left="792"/>
+      </w:pPr>
+      <w:r>
+        <w:rPr>
+          <w:sz w:val="20"/>
+        </w:rPr>
+        <w:t>Complétala y súbela (o copia/pega).</w:t>
+      </w:r>
+    </w:p>
+    <w:p>
+      <w:pPr>
+        <w:spacing w:before="20"/>
+        <w:ind w:left="403"/>
+      </w:pPr>
+      <w:r>
+        <w:rPr>
+          <w:b/>
+          <w:color w:val="0A7D33"/>
+          <w:sz w:val="19"/>
+        </w:rPr>
+        <w:t xml:space="preserve">Esperado:  </w:t>
+      </w:r>
+      <w:r>
+        <w:rPr>
+          <w:color w:val="1A1516"/>
+          <w:sz w:val="19"/>
+        </w:rPr>
+        <w:t>Se importa aunque tenga las filas de marca arriba; crea las partidas por Nivel.</w:t>
+      </w:r>
+    </w:p>
+    <w:p>
+      <w:pPr>
         <w:spacing w:before="200" w:after="40"/>
       </w:pPr>
       <w:r>
@@ -1376,188 +915,6 @@
         </w:pBdr>
         <w:spacing w:after="40"/>
       </w:pPr>
-    </w:p>
-    <w:p>
-      <w:pPr>
-        <w:spacing w:before="160" w:after="0"/>
-      </w:pPr>
-      <w:r>
-        <w:rPr>
-          <w:sz w:val="24"/>
-        </w:rPr>
-        <w:t xml:space="preserve">☐  </w:t>
-      </w:r>
-      <w:r>
-        <w:rPr>
-          <w:b/>
-          <w:color w:val="1A1516"/>
-          <w:sz w:val="23"/>
-        </w:rPr>
-        <w:t>Roles personalizados (por módulo)</w:t>
-      </w:r>
-      <w:r>
-        <w:rPr>
-          <w:color w:val="666666"/>
-          <w:sz w:val="15"/>
-        </w:rPr>
-        <w:t xml:space="preserve">    SEGURIDAD</w:t>
-      </w:r>
-    </w:p>
-    <w:p>
-      <w:pPr>
-        <w:spacing w:after="40"/>
-        <w:ind w:left="403"/>
-      </w:pPr>
-      <w:r>
-        <w:rPr>
-          <w:i/>
-          <w:color w:val="666666"/>
-          <w:sz w:val="19"/>
-        </w:rPr>
-        <w:t>Crea roles a medida: por cada módulo, Sin acceso / Solo ver / Editar.</w:t>
-      </w:r>
-    </w:p>
-    <w:p>
-      <w:pPr>
-        <w:pStyle w:val="ListNumber"/>
-        <w:ind w:left="792"/>
-      </w:pPr>
-      <w:r>
-        <w:rPr>
-          <w:sz w:val="20"/>
-        </w:rPr>
-        <w:t>Usuarios → Nuevo rol.</w:t>
-      </w:r>
-    </w:p>
-    <w:p>
-      <w:pPr>
-        <w:pStyle w:val="ListNumber"/>
-        <w:ind w:left="792"/>
-      </w:pPr>
-      <w:r>
-        <w:rPr>
-          <w:sz w:val="20"/>
-        </w:rPr>
-        <w:t>Nómbralo y marca por módulo: Sin acceso / Solo ver / Editar.</w:t>
-      </w:r>
-    </w:p>
-    <w:p>
-      <w:pPr>
-        <w:pStyle w:val="ListNumber"/>
-        <w:ind w:left="792"/>
-      </w:pPr>
-      <w:r>
-        <w:rPr>
-          <w:sz w:val="20"/>
-        </w:rPr>
-        <w:t>Asígnalo a un usuario (en su fila o al crearlo).</w:t>
-      </w:r>
-    </w:p>
-    <w:p>
-      <w:pPr>
-        <w:spacing w:before="20"/>
-        <w:ind w:left="403"/>
-      </w:pPr>
-      <w:r>
-        <w:rPr>
-          <w:b/>
-          <w:color w:val="0A7D33"/>
-          <w:sz w:val="19"/>
-        </w:rPr>
-        <w:t xml:space="preserve">Esperado:  </w:t>
-      </w:r>
-      <w:r>
-        <w:rPr>
-          <w:color w:val="1A1516"/>
-          <w:sz w:val="19"/>
-        </w:rPr>
-        <w:t>Un “Solo ver” no puede crear/editar: bloqueado en el servidor y con los botones ocultos.</w:t>
-      </w:r>
-    </w:p>
-    <w:p>
-      <w:pPr>
-        <w:spacing w:before="160" w:after="0"/>
-      </w:pPr>
-      <w:r>
-        <w:rPr>
-          <w:sz w:val="24"/>
-        </w:rPr>
-        <w:t xml:space="preserve">☐  </w:t>
-      </w:r>
-      <w:r>
-        <w:rPr>
-          <w:b/>
-          <w:color w:val="1A1516"/>
-          <w:sz w:val="23"/>
-        </w:rPr>
-        <w:t>Editar datos del usuario</w:t>
-      </w:r>
-      <w:r>
-        <w:rPr>
-          <w:color w:val="666666"/>
-          <w:sz w:val="15"/>
-        </w:rPr>
-        <w:t xml:space="preserve">    USUARIOS</w:t>
-      </w:r>
-    </w:p>
-    <w:p>
-      <w:pPr>
-        <w:spacing w:after="40"/>
-        <w:ind w:left="403"/>
-      </w:pPr>
-      <w:r>
-        <w:rPr>
-          <w:i/>
-          <w:color w:val="666666"/>
-          <w:sz w:val="19"/>
-        </w:rPr>
-        <w:t>Antes no se podía cambiar nombre/email/teléfono.</w:t>
-      </w:r>
-    </w:p>
-    <w:p>
-      <w:pPr>
-        <w:pStyle w:val="ListNumber"/>
-        <w:ind w:left="792"/>
-      </w:pPr>
-      <w:r>
-        <w:rPr>
-          <w:sz w:val="20"/>
-        </w:rPr>
-        <w:t>Usuarios → Editar en la fila.</w:t>
-      </w:r>
-    </w:p>
-    <w:p>
-      <w:pPr>
-        <w:pStyle w:val="ListNumber"/>
-        <w:ind w:left="792"/>
-      </w:pPr>
-      <w:r>
-        <w:rPr>
-          <w:sz w:val="20"/>
-        </w:rPr>
-        <w:t>Cambia nombre, email o teléfono.</w:t>
-      </w:r>
-    </w:p>
-    <w:p>
-      <w:pPr>
-        <w:spacing w:before="20"/>
-        <w:ind w:left="403"/>
-      </w:pPr>
-      <w:r>
-        <w:rPr>
-          <w:b/>
-          <w:color w:val="0A7D33"/>
-          <w:sz w:val="19"/>
-        </w:rPr>
-        <w:t xml:space="preserve">Esperado:  </w:t>
-      </w:r>
-      <w:r>
-        <w:rPr>
-          <w:color w:val="1A1516"/>
-          <w:sz w:val="19"/>
-        </w:rPr>
-        <w:t>Se guardan los cambios (el email se actualiza también en el acceso).</w:t>
-      </w:r>
     </w:p>
     <w:p>
       <w:pPr>
@@ -1660,14 +1017,14 @@
           <w:color w:val="1A1516"/>
           <w:sz w:val="23"/>
         </w:rPr>
-        <w:t>Botones ocultos en “Solo ver”</w:t>
+        <w:t>Editar teléfono en línea (pedido de Juan)</w:t>
       </w:r>
       <w:r>
         <w:rPr>
           <w:color w:val="666666"/>
           <w:sz w:val="15"/>
         </w:rPr>
-        <w:t xml:space="preserve">    SEGURIDAD</w:t>
+        <w:t xml:space="preserve">    USUARIOS</w:t>
       </w:r>
     </w:p>
     <w:p>
@@ -1681,7 +1038,7 @@
           <w:color w:val="666666"/>
           <w:sz w:val="19"/>
         </w:rPr>
-        <w:t>Coherencia visual con el permiso.</w:t>
+        <w:t>Gerencia/Admin edita el teléfono directo en el panel, sin abrir Editar.</w:t>
       </w:r>
     </w:p>
     <w:p>
@@ -1693,7 +1050,19 @@
         <w:rPr>
           <w:sz w:val="20"/>
         </w:rPr>
-        <w:t>Con un usuario “Solo ver”, entra a Finanzas / Almacén / Catálogos / Clientes.</w:t>
+        <w:t>Usuarios → clic en el teléfono de una fila.</w:t>
+      </w:r>
+    </w:p>
+    <w:p>
+      <w:pPr>
+        <w:pStyle w:val="ListNumber"/>
+        <w:ind w:left="792"/>
+      </w:pPr>
+      <w:r>
+        <w:rPr>
+          <w:sz w:val="20"/>
+        </w:rPr>
+        <w:t>Escribe el número y sal del campo (o presiona Enter).</w:t>
       </w:r>
     </w:p>
     <w:p>
@@ -1714,7 +1083,7 @@
           <w:color w:val="1A1516"/>
           <w:sz w:val="19"/>
         </w:rPr>
-        <w:t>No aparecen los botones Nuevo/Editar/Borrar (además el servidor los bloquea).</w:t>
+        <w:t>Se guarda al instante. Los usuarios sin permiso lo ven como texto.</w:t>
       </w:r>
     </w:p>
     <w:p>
@@ -1783,7 +1152,7 @@
           <w:color w:val="666666"/>
           <w:sz w:val="19"/>
         </w:rPr>
-        <w:t>Cada usuario carga su firma PNG.</w:t>
+        <w:t>Cada usuario carga su firma PNG; se ve en el perfil.</w:t>
       </w:r>
     </w:p>
     <w:p>
@@ -1956,7 +1325,7 @@
           <w:color w:val="1A1516"/>
           <w:sz w:val="23"/>
         </w:rPr>
-        <w:t>Firma del gerente único</w:t>
+        <w:t>Firma del Jefe de Proyectos y del gerente único</w:t>
       </w:r>
       <w:r>
         <w:rPr>
@@ -1977,7 +1346,7 @@
           <w:color w:val="666666"/>
           <w:sz w:val="19"/>
         </w:rPr>
-        <w:t>Como hay un solo gerente, va automática.</w:t>
+        <w:t>En la valorización salen automáticas si no configuras firmantes.</w:t>
       </w:r>
     </w:p>
     <w:p>
@@ -2010,7 +1379,7 @@
           <w:color w:val="1A1516"/>
           <w:sz w:val="19"/>
         </w:rPr>
-        <w:t>En “Aprobado por · Gerencia” sale el nombre y la firma del gerente (si la tiene cargada).</w:t>
+        <w:t>Jefe de Proyectos en “Elaborado por” y el gerente único en “Aprobado por · Gerencia” (con su firma si la tienen).</w:t>
       </w:r>
     </w:p>
     <w:p>
@@ -2084,453 +1453,6 @@
           <w:sz w:val="19"/>
         </w:rPr>
         <w:t>Hay más espacio arriba de las líneas de firma.</w:t>
-      </w:r>
-    </w:p>
-    <w:p>
-      <w:pPr>
-        <w:spacing w:before="200" w:after="40"/>
-      </w:pPr>
-      <w:r>
-        <w:rPr>
-          <w:b/>
-          <w:color w:val="E20627"/>
-          <w:sz w:val="26"/>
-        </w:rPr>
-        <w:t xml:space="preserve">04  </w:t>
-      </w:r>
-      <w:r>
-        <w:rPr>
-          <w:b/>
-          <w:color w:val="1A1516"/>
-          <w:sz w:val="28"/>
-        </w:rPr>
-        <w:t>Cuentas de empresa y PDFs</w:t>
-      </w:r>
-    </w:p>
-    <w:p>
-      <w:pPr>
-        <w:pBdr>
-          <w:bottom w:val="single" w:sz="10" w:space="1" w:color="E20627"/>
-        </w:pBdr>
-        <w:spacing w:after="40"/>
-      </w:pPr>
-    </w:p>
-    <w:p>
-      <w:pPr>
-        <w:spacing w:before="160" w:after="0"/>
-      </w:pPr>
-      <w:r>
-        <w:rPr>
-          <w:sz w:val="24"/>
-        </w:rPr>
-        <w:t xml:space="preserve">☐  </w:t>
-      </w:r>
-      <w:r>
-        <w:rPr>
-          <w:b/>
-          <w:color w:val="1A1516"/>
-          <w:sz w:val="23"/>
-        </w:rPr>
-        <w:t>Cuentas reales + dónde se muestran</w:t>
-      </w:r>
-      <w:r>
-        <w:rPr>
-          <w:color w:val="666666"/>
-          <w:sz w:val="15"/>
-        </w:rPr>
-        <w:t xml:space="preserve">    CATÁLOGOS</w:t>
-      </w:r>
-    </w:p>
-    <w:p>
-      <w:pPr>
-        <w:spacing w:after="40"/>
-        <w:ind w:left="403"/>
-      </w:pPr>
-      <w:r>
-        <w:rPr>
-          <w:i/>
-          <w:color w:val="666666"/>
-          <w:sz w:val="19"/>
-        </w:rPr>
-        <w:t>Cuentas AZUR reales; eliges el documento por cuenta.</w:t>
-      </w:r>
-    </w:p>
-    <w:p>
-      <w:pPr>
-        <w:pStyle w:val="ListNumber"/>
-        <w:ind w:left="792"/>
-      </w:pPr>
-      <w:r>
-        <w:rPr>
-          <w:sz w:val="20"/>
-        </w:rPr>
-        <w:t>Catálogos → Medios de pago.</w:t>
-      </w:r>
-    </w:p>
-    <w:p>
-      <w:pPr>
-        <w:pStyle w:val="ListNumber"/>
-        <w:ind w:left="792"/>
-      </w:pPr>
-      <w:r>
-        <w:rPr>
-          <w:sz w:val="20"/>
-        </w:rPr>
-        <w:t>Cada cuenta tiene toggles Mostrar en: Cotización / Valorización / Liquidación.</w:t>
-      </w:r>
-    </w:p>
-    <w:p>
-      <w:pPr>
-        <w:pStyle w:val="ListNumber"/>
-        <w:ind w:left="792"/>
-      </w:pPr>
-      <w:r>
-        <w:rPr>
-          <w:sz w:val="20"/>
-        </w:rPr>
-        <w:t>Genera cada PDF.</w:t>
-      </w:r>
-    </w:p>
-    <w:p>
-      <w:pPr>
-        <w:spacing w:before="20"/>
-        <w:ind w:left="403"/>
-      </w:pPr>
-      <w:r>
-        <w:rPr>
-          <w:b/>
-          <w:color w:val="0A7D33"/>
-          <w:sz w:val="19"/>
-        </w:rPr>
-        <w:t xml:space="preserve">Esperado:  </w:t>
-      </w:r>
-      <w:r>
-        <w:rPr>
-          <w:color w:val="1A1516"/>
-          <w:sz w:val="19"/>
-        </w:rPr>
-        <w:t>Cada cuenta aparece solo en los documentos marcados (BBVA soles + Interbank soles/dólares reales).</w:t>
-      </w:r>
-    </w:p>
-    <w:p>
-      <w:pPr>
-        <w:spacing w:before="160" w:after="0"/>
-      </w:pPr>
-      <w:r>
-        <w:rPr>
-          <w:sz w:val="24"/>
-        </w:rPr>
-        <w:t xml:space="preserve">☐  </w:t>
-      </w:r>
-      <w:r>
-        <w:rPr>
-          <w:b/>
-          <w:color w:val="1A1516"/>
-          <w:sz w:val="23"/>
-        </w:rPr>
-        <w:t>Medios de pago en valorización/liquidación</w:t>
-      </w:r>
-      <w:r>
-        <w:rPr>
-          <w:color w:val="666666"/>
-          <w:sz w:val="15"/>
-        </w:rPr>
-        <w:t xml:space="preserve">    PDF</w:t>
-      </w:r>
-    </w:p>
-    <w:p>
-      <w:pPr>
-        <w:spacing w:after="40"/>
-        <w:ind w:left="403"/>
-      </w:pPr>
-      <w:r>
-        <w:rPr>
-          <w:i/>
-          <w:color w:val="666666"/>
-          <w:sz w:val="19"/>
-        </w:rPr>
-        <w:t>El cliente ve dónde depositar.</w:t>
-      </w:r>
-    </w:p>
-    <w:p>
-      <w:pPr>
-        <w:pStyle w:val="ListNumber"/>
-        <w:ind w:left="792"/>
-      </w:pPr>
-      <w:r>
-        <w:rPr>
-          <w:sz w:val="20"/>
-        </w:rPr>
-        <w:t>Genera una valorización o liquidación.</w:t>
-      </w:r>
-    </w:p>
-    <w:p>
-      <w:pPr>
-        <w:spacing w:before="20"/>
-        <w:ind w:left="403"/>
-      </w:pPr>
-      <w:r>
-        <w:rPr>
-          <w:b/>
-          <w:color w:val="0A7D33"/>
-          <w:sz w:val="19"/>
-        </w:rPr>
-        <w:t xml:space="preserve">Esperado:  </w:t>
-      </w:r>
-      <w:r>
-        <w:rPr>
-          <w:color w:val="1A1516"/>
-          <w:sz w:val="19"/>
-        </w:rPr>
-        <w:t>Aparece el bloque “Medios de pago — depositar a nombre de…”.</w:t>
-      </w:r>
-    </w:p>
-    <w:p>
-      <w:pPr>
-        <w:spacing w:before="160" w:after="0"/>
-      </w:pPr>
-      <w:r>
-        <w:rPr>
-          <w:sz w:val="24"/>
-        </w:rPr>
-        <w:t xml:space="preserve">☐  </w:t>
-      </w:r>
-      <w:r>
-        <w:rPr>
-          <w:b/>
-          <w:color w:val="1A1516"/>
-          <w:sz w:val="23"/>
-        </w:rPr>
-        <w:t>Cabecera fija + tabla que se repite + firma nunca sola</w:t>
-      </w:r>
-      <w:r>
-        <w:rPr>
-          <w:color w:val="666666"/>
-          <w:sz w:val="15"/>
-        </w:rPr>
-        <w:t xml:space="preserve">    PDF</w:t>
-      </w:r>
-    </w:p>
-    <w:p>
-      <w:pPr>
-        <w:spacing w:after="40"/>
-        <w:ind w:left="403"/>
-      </w:pPr>
-      <w:r>
-        <w:rPr>
-          <w:i/>
-          <w:color w:val="666666"/>
-          <w:sz w:val="19"/>
-        </w:rPr>
-        <w:t>Documentos multipágina bien armados.</w:t>
-      </w:r>
-    </w:p>
-    <w:p>
-      <w:pPr>
-        <w:pStyle w:val="ListNumber"/>
-        <w:ind w:left="792"/>
-      </w:pPr>
-      <w:r>
-        <w:rPr>
-          <w:sz w:val="20"/>
-        </w:rPr>
-        <w:t>Genera una valorización con muchas partidas (varias páginas).</w:t>
-      </w:r>
-    </w:p>
-    <w:p>
-      <w:pPr>
-        <w:spacing w:before="20"/>
-        <w:ind w:left="403"/>
-      </w:pPr>
-      <w:r>
-        <w:rPr>
-          <w:b/>
-          <w:color w:val="0A7D33"/>
-          <w:sz w:val="19"/>
-        </w:rPr>
-        <w:t xml:space="preserve">Esperado:  </w:t>
-      </w:r>
-      <w:r>
-        <w:rPr>
-          <w:color w:val="1A1516"/>
-          <w:sz w:val="19"/>
-        </w:rPr>
-        <w:t>La cabecera AZUR y el encabezado de columnas se repiten en cada hoja; la firma nunca queda sola. Verificado por render.</w:t>
-      </w:r>
-    </w:p>
-    <w:p>
-      <w:pPr>
-        <w:spacing w:before="200" w:after="40"/>
-      </w:pPr>
-      <w:r>
-        <w:rPr>
-          <w:b/>
-          <w:color w:val="E20627"/>
-          <w:sz w:val="26"/>
-        </w:rPr>
-        <w:t xml:space="preserve">05  </w:t>
-      </w:r>
-      <w:r>
-        <w:rPr>
-          <w:b/>
-          <w:color w:val="1A1516"/>
-          <w:sz w:val="28"/>
-        </w:rPr>
-        <w:t>Proyecto / Dashboard</w:t>
-      </w:r>
-    </w:p>
-    <w:p>
-      <w:pPr>
-        <w:pBdr>
-          <w:bottom w:val="single" w:sz="10" w:space="1" w:color="E20627"/>
-        </w:pBdr>
-        <w:spacing w:after="40"/>
-      </w:pPr>
-    </w:p>
-    <w:p>
-      <w:pPr>
-        <w:spacing w:before="160" w:after="0"/>
-      </w:pPr>
-      <w:r>
-        <w:rPr>
-          <w:sz w:val="24"/>
-        </w:rPr>
-        <w:t xml:space="preserve">☐  </w:t>
-      </w:r>
-      <w:r>
-        <w:rPr>
-          <w:b/>
-          <w:color w:val="1A1516"/>
-          <w:sz w:val="23"/>
-        </w:rPr>
-        <w:t>Comparativo Comercial vs Proyecto en soles</w:t>
-      </w:r>
-      <w:r>
-        <w:rPr>
-          <w:color w:val="666666"/>
-          <w:sz w:val="15"/>
-        </w:rPr>
-        <w:t xml:space="preserve">    BUG CLAVE</w:t>
-      </w:r>
-    </w:p>
-    <w:p>
-      <w:pPr>
-        <w:spacing w:after="40"/>
-        <w:ind w:left="403"/>
-      </w:pPr>
-      <w:r>
-        <w:rPr>
-          <w:i/>
-          <w:color w:val="666666"/>
-          <w:sz w:val="19"/>
-        </w:rPr>
-        <w:t>Antes mezclaba dólares y soles (desviación falsa).</w:t>
-      </w:r>
-    </w:p>
-    <w:p>
-      <w:pPr>
-        <w:pStyle w:val="ListNumber"/>
-        <w:ind w:left="792"/>
-      </w:pPr>
-      <w:r>
-        <w:rPr>
-          <w:sz w:val="20"/>
-        </w:rPr>
-        <w:t>Abre un proyecto en dólares (ej. Pelícanos) → Resumen → Comparativo Comercial vs Proyecto.</w:t>
-      </w:r>
-    </w:p>
-    <w:p>
-      <w:pPr>
-        <w:spacing w:before="20"/>
-        <w:ind w:left="403"/>
-      </w:pPr>
-      <w:r>
-        <w:rPr>
-          <w:b/>
-          <w:color w:val="0A7D33"/>
-          <w:sz w:val="19"/>
-        </w:rPr>
-        <w:t xml:space="preserve">Esperado:  </w:t>
-      </w:r>
-      <w:r>
-        <w:rPr>
-          <w:color w:val="1A1516"/>
-          <w:sz w:val="19"/>
-        </w:rPr>
-        <w:t>Compara en soles: márgenes iguales (~42.7% vs 42.7%) y desviación ~0. Badge USD → S/ · T.C. 3.500 + tips (?) que explican cada número.</w:t>
-      </w:r>
-    </w:p>
-    <w:p>
-      <w:pPr>
-        <w:spacing w:before="160" w:after="0"/>
-      </w:pPr>
-      <w:r>
-        <w:rPr>
-          <w:sz w:val="24"/>
-        </w:rPr>
-        <w:t xml:space="preserve">☐  </w:t>
-      </w:r>
-      <w:r>
-        <w:rPr>
-          <w:b/>
-          <w:color w:val="1A1516"/>
-          <w:sz w:val="23"/>
-        </w:rPr>
-        <w:t>Optimismo: agregar/borrar/restaurar sin recargar</w:t>
-      </w:r>
-      <w:r>
-        <w:rPr>
-          <w:color w:val="666666"/>
-          <w:sz w:val="15"/>
-        </w:rPr>
-        <w:t xml:space="preserve">    FLUIDEZ</w:t>
-      </w:r>
-    </w:p>
-    <w:p>
-      <w:pPr>
-        <w:spacing w:after="40"/>
-        <w:ind w:left="403"/>
-      </w:pPr>
-      <w:r>
-        <w:rPr>
-          <w:i/>
-          <w:color w:val="666666"/>
-          <w:sz w:val="19"/>
-        </w:rPr>
-        <w:t>La UI responde al instante.</w:t>
-      </w:r>
-    </w:p>
-    <w:p>
-      <w:pPr>
-        <w:pStyle w:val="ListNumber"/>
-        <w:ind w:left="792"/>
-      </w:pPr>
-      <w:r>
-        <w:rPr>
-          <w:sz w:val="20"/>
-        </w:rPr>
-        <w:t>Agrega o borra una partida; restaura una versión guardada.</w:t>
-      </w:r>
-    </w:p>
-    <w:p>
-      <w:pPr>
-        <w:spacing w:before="20"/>
-        <w:ind w:left="403"/>
-      </w:pPr>
-      <w:r>
-        <w:rPr>
-          <w:b/>
-          <w:color w:val="0A7D33"/>
-          <w:sz w:val="19"/>
-        </w:rPr>
-        <w:t xml:space="preserve">Esperado:  </w:t>
-      </w:r>
-      <w:r>
-        <w:rPr>
-          <w:color w:val="1A1516"/>
-          <w:sz w:val="19"/>
-        </w:rPr>
-        <w:t>No recarga la página; el spinner de restauración es por-versión y termina con “Restaurado ✓”.</w:t>
       </w:r>
     </w:p>
     <w:p/>

</xml_diff>